<commit_message>
Add retraining and future-input evidence
</commit_message>
<xml_diff>
--- a/part4/docs/Jason_Chen_p4_su26_FINAL.docx
+++ b/part4/docs/Jason_Chen_p4_su26_FINAL.docx
@@ -2297,6 +2297,121 @@
       </w:r>
     </w:p>
     <w:p/>
+    <w:p>
+      <w:pPr>
+        <w:keepNext/>
+        <w:jc w:val="center"/>
+      </w:pPr>
+      <w:r>
+        <w:rPr/>
+        <w:t>Figure A11. Database-driven Random Forest retraining with a chronological train/test split.</w:t>
+      </w:r>
+    </w:p>
+    <w:p>
+      <w:pPr>
+        <w:jc w:val="center"/>
+      </w:pPr>
+      <w:r>
+        <w:drawing>
+          <wp:inline xmlns:a="http://schemas.openxmlformats.org/drawingml/2006/main" xmlns:pic="http://schemas.openxmlformats.org/drawingml/2006/picture">
+            <wp:extent cx="5943600" cy="1253878"/>
+            <wp:docPr id="2050628062" name="Picture 2050628062"/>
+            <wp:cNvGraphicFramePr>
+              <a:graphicFrameLocks noChangeAspect="1"/>
+            </wp:cNvGraphicFramePr>
+            <a:graphic>
+              <a:graphicData uri="http://schemas.openxmlformats.org/drawingml/2006/picture">
+                <pic:pic>
+                  <pic:nvPicPr>
+                    <pic:cNvPr id="0" name="codex-clipboard-83c06d96-18e3-4ee6-ac80-34a855ad260a.png"/>
+                    <pic:cNvPicPr/>
+                  </pic:nvPicPr>
+                  <pic:blipFill>
+                    <a:blip r:embed="rId31"/>
+                    <a:stretch>
+                      <a:fillRect/>
+                    </a:stretch>
+                  </pic:blipFill>
+                  <pic:spPr>
+                    <a:xfrm>
+                      <a:off x="0" y="0"/>
+                      <a:ext cx="5943600" cy="1253878"/>
+                    </a:xfrm>
+                    <a:prstGeom prst="rect"/>
+                  </pic:spPr>
+                </pic:pic>
+              </a:graphicData>
+            </a:graphic>
+          </wp:inline>
+        </w:drawing>
+      </w:r>
+    </w:p>
+    <w:p>
+      <w:pPr>
+        <w:keepLines/>
+      </w:pPr>
+      <w:r>
+        <w:t>The retraining module read 11,667 hourly ridership observations directly from PostgreSQL and applied a chronological 80/20 train/test split. The candidate model achieved 76.75% test accuracy and was saved with a JSON evaluation report. Because its performance did not exceed the 84.8% production baseline, the production model was not overwritten.</w:t>
+      </w:r>
+    </w:p>
+    <w:p>
+      <w:pPr>
+        <w:keepNext/>
+        <w:pageBreakBefore/>
+        <w:jc w:val="center"/>
+      </w:pPr>
+      <w:r>
+        <w:rPr/>
+        <w:t>Figure A12. Streamlit interface for submitting a future congestion prediction request.</w:t>
+      </w:r>
+    </w:p>
+    <w:p>
+      <w:pPr>
+        <w:jc w:val="center"/>
+      </w:pPr>
+      <w:r>
+        <w:drawing>
+          <wp:inline xmlns:a="http://schemas.openxmlformats.org/drawingml/2006/main" xmlns:pic="http://schemas.openxmlformats.org/drawingml/2006/picture">
+            <wp:extent cx="5669280" cy="4175600"/>
+            <wp:docPr id="2050628063" name="Picture 2050628063"/>
+            <wp:cNvGraphicFramePr>
+              <a:graphicFrameLocks noChangeAspect="1"/>
+            </wp:cNvGraphicFramePr>
+            <a:graphic>
+              <a:graphicData uri="http://schemas.openxmlformats.org/drawingml/2006/picture">
+                <pic:pic>
+                  <pic:nvPicPr>
+                    <pic:cNvPr id="0" name="codex-clipboard-64130103-0ad2-49fc-91d9-e008576e392b.png"/>
+                    <pic:cNvPicPr/>
+                  </pic:nvPicPr>
+                  <pic:blipFill>
+                    <a:blip r:embed="rId32"/>
+                    <a:stretch>
+                      <a:fillRect/>
+                    </a:stretch>
+                  </pic:blipFill>
+                  <pic:spPr>
+                    <a:xfrm>
+                      <a:off x="0" y="0"/>
+                      <a:ext cx="5669280" cy="4175600"/>
+                    </a:xfrm>
+                    <a:prstGeom prst="rect"/>
+                  </pic:spPr>
+                </pic:pic>
+              </a:graphicData>
+            </a:graphic>
+          </wp:inline>
+        </w:drawing>
+      </w:r>
+    </w:p>
+    <w:p>
+      <w:pPr>
+        <w:keepLines/>
+      </w:pPr>
+      <w:r>
+        <w:t>The Streamlit interface allows a commuter to select an NYU-area subway station and submit a future travel date and time. The request is passed to the prediction service, which loads the persisted Random Forest model and writes the resulting prediction to PostgreSQL.</w:t>
+      </w:r>
+    </w:p>
     <w:sectPr>
       <w:footerReference w:type="default" r:id="rId28"/>
       <w:pgSz w:w="11906" w:h="16838"/>

</xml_diff>